<commit_message>
docs: HTML- und DOCX-Exporte auf Review-Loop-Policy v2 nachgezogen
Die handgestylten HTML-Companions (USER-HANDBUCH, CONTROL-FLOW-HANDOUT,
TECHNISCHE-SPEC, je EN+DE) beschreiben jetzt wie die Markdown-Quellen die
Review-Loop-Policy v2 (max. 5 Runden, absteigende Severity-Schwelle,
Findings-Gedächtnis ab Runde 2) inkl. SVG-Loop-Labels ("bis ok, max. 5x"),
Limits-Tabellen und followups.md-Beschreibung; dazu der Drift aus 7140680
(vertagte P3s) in den USER-HANDBUCH-HTMLs. Die 6 DOCX wurden per pandoc aus
den aktualisierten HTMLs regeneriert (Handout je 4 Vektor-SVGs eingebettet,
verifiziert via verify_docx). E2E-/Gate-Limits (10) unverändert.

Co-Authored-By: Claude Fable 5 <noreply@anthropic.com>
Claude-Session: https://claude.ai/code/session_016n1jVETBbtMq9B7CxDagj7
</commit_message>
<xml_diff>
--- a/docs/handbuch/ADW-CONTROL-FLOW-HANDOUT.de.docx
+++ b/docs/handbuch/ADW-CONTROL-FLOW-HANDOUT.de.docx
@@ -1207,20 +1207,29 @@
             <w:r>
               <w:drawing>
                 <wp:inline>
-                  <wp:extent cx="5753100" cy="7421498"/>
+                  <wp:extent cx="5753100" cy="3835400"/>
                   <wp:effectExtent b="0" l="0" r="0" t="0"/>
-                  <wp:docPr descr="Flussdiagramm der sieben ADW-Phasen mit Schleifen und Rücksprüngen" title="" id="27" name="Picture"/>
+                  <wp:docPr descr="" title="" id="27" name="Picture"/>
                   <a:graphic>
                     <a:graphicData uri="http://schemas.openxmlformats.org/drawingml/2006/picture">
                       <pic:pic>
                         <pic:nvPicPr>
-                          <pic:cNvPr descr="diagramm-1.png" id="28" name="Picture"/>
+                          <pic:cNvPr descr="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" id="28" name="Picture"/>
                           <pic:cNvPicPr>
                             <a:picLocks noChangeArrowheads="1" noChangeAspect="1"/>
                           </pic:cNvPicPr>
                         </pic:nvPicPr>
                         <pic:blipFill>
-                          <a:blip r:embed="rId26"/>
+                          <a:blip>
+                            <a:extLst>
+                              <a:ext uri="{28A0092B-C50C-407E-A947-70E740481C1C}">
+                                <a14:useLocalDpi xmlns:a14="http://schemas.microsoft.com/office/drawing/2010/main" val="0"/>
+                              </a:ext>
+                              <a:ext uri="{96DAC541-7B7A-43D3-8B79-37D633B846F1}">
+                                <asvg:svgBlip xmlns:asvg="http://schemas.microsoft.com/office/drawing/2016/SVG/main" r:embed="rId26"/>
+                              </a:ext>
+                            </a:extLst>
+                          </a:blip>
                           <a:stretch>
                             <a:fillRect/>
                           </a:stretch>
@@ -1228,7 +1237,7 @@
                         <pic:spPr bwMode="auto">
                           <a:xfrm>
                             <a:off x="0" y="0"/>
-                            <a:ext cx="5753100" cy="7421498"/>
+                            <a:ext cx="5753100" cy="3835400"/>
                           </a:xfrm>
                           <a:prstGeom prst="rect">
                             <a:avLst/>
@@ -1331,7 +1340,33 @@
         <w:t xml:space="preserve">Session-Resume</w:t>
       </w:r>
       <w:r>
-        <w:t xml:space="preserve">) — er muss sich nicht jedes Mal neu einarbeiten.</w:t>
+        <w:t xml:space="preserve">) — er muss sich nicht jedes Mal neu einarbeiten. Damit die Schleife garantiert konvergiert, gilt überall dieselbe</w:t>
+      </w:r>
+      <w:r>
+        <w:t xml:space="preserve"> </w:t>
+      </w:r>
+      <w:r>
+        <w:rPr>
+          <w:b/>
+          <w:bCs/>
+        </w:rPr>
+        <w:t xml:space="preserve">Review-Loop-Policy</w:t>
+      </w:r>
+      <w:r>
+        <w:t xml:space="preserve">: höchstens</w:t>
+      </w:r>
+      <w:r>
+        <w:t xml:space="preserve"> </w:t>
+      </w:r>
+      <w:r>
+        <w:rPr>
+          <w:b/>
+          <w:bCs/>
+        </w:rPr>
+        <w:t xml:space="preserve">5 Runden</w:t>
+      </w:r>
+      <w:r>
+        <w:t xml:space="preserve">, und die Messlatte sinkt pro Runde — Runde 1 behandelt alle Findings, Runde 2 nur noch kritische und mittlere (P1+P2), ab Runde 3 nur noch kritische (P1); kleinere Punkte werden als bekannte Einschränkungen dokumentiert. Außerdem bekommt der Prüfer ab Runde 2 die Findings der Vorrunden samt Begründung mit („behoben" bzw. „bewusst nicht übernommen, weil …"), damit er nicht dieselben Punkte immer wieder anmerkt.</w:t>
       </w:r>
     </w:p>
     <w:tbl>
@@ -1355,20 +1390,29 @@
             <w:r>
               <w:drawing>
                 <wp:inline>
-                  <wp:extent cx="5753100" cy="2129193"/>
+                  <wp:extent cx="5753100" cy="3835400"/>
                   <wp:effectExtent b="0" l="0" r="0" t="0"/>
-                  <wp:docPr descr="Diagramm der Prüf-Schleife: Agent erstellt, Codex prüft, Findings gehen zurück bis ok" title="" id="31" name="Picture"/>
+                  <wp:docPr descr="" title="" id="31" name="Picture"/>
                   <a:graphic>
                     <a:graphicData uri="http://schemas.openxmlformats.org/drawingml/2006/picture">
                       <pic:pic>
                         <pic:nvPicPr>
-                          <pic:cNvPr descr="diagramm-2.png" id="32" name="Picture"/>
+                          <pic:cNvPr descr="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" id="32" name="Picture"/>
                           <pic:cNvPicPr>
                             <a:picLocks noChangeArrowheads="1" noChangeAspect="1"/>
                           </pic:cNvPicPr>
                         </pic:nvPicPr>
                         <pic:blipFill>
-                          <a:blip r:embed="rId30"/>
+                          <a:blip>
+                            <a:extLst>
+                              <a:ext uri="{28A0092B-C50C-407E-A947-70E740481C1C}">
+                                <a14:useLocalDpi xmlns:a14="http://schemas.microsoft.com/office/drawing/2010/main" val="0"/>
+                              </a:ext>
+                              <a:ext uri="{96DAC541-7B7A-43D3-8B79-37D633B846F1}">
+                                <asvg:svgBlip xmlns:asvg="http://schemas.microsoft.com/office/drawing/2016/SVG/main" r:embed="rId30"/>
+                              </a:ext>
+                            </a:extLst>
+                          </a:blip>
                           <a:stretch>
                             <a:fillRect/>
                           </a:stretch>
@@ -1376,7 +1420,7 @@
                         <pic:spPr bwMode="auto">
                           <a:xfrm>
                             <a:off x="0" y="0"/>
-                            <a:ext cx="5753100" cy="2129193"/>
+                            <a:ext cx="5753100" cy="3835400"/>
                           </a:xfrm>
                           <a:prstGeom prst="rect">
                             <a:avLst/>
@@ -1403,7 +1447,7 @@
         <w:pStyle w:val="ImageCaption"/>
       </w:pPr>
       <w:r>
-        <w:t xml:space="preserve">Abb. 2 — Das Grundmuster „Erstellen → Prüfen → Nachbessern", das in den Phasen 1, 2 und 5 identisch arbeitet.</w:t>
+        <w:t xml:space="preserve">Abb. 2 — Das Grundmuster „Erstellen → Prüfen → Nachbessern", das in den Phasen 1, 2 und 5 identisch arbeitet — maximal 5 Runden, mit pro Runde sinkender Severity-Schwelle und Findings-Gedächtnis ab Runde 2.</w:t>
       </w:r>
     </w:p>
     <w:bookmarkEnd w:id="33"/>
@@ -1623,7 +1667,20 @@
         <w:t xml:space="preserve"> </w:t>
       </w:r>
       <w:r>
-        <w:t xml:space="preserve">sagt (Prüf-Schleife, siehe Abb. 2).</w:t>
+        <w:t xml:space="preserve">sagt — höchstens</w:t>
+      </w:r>
+      <w:r>
+        <w:t xml:space="preserve"> </w:t>
+      </w:r>
+      <w:r>
+        <w:rPr>
+          <w:b/>
+          <w:bCs/>
+        </w:rPr>
+        <w:t xml:space="preserve">5 Runden</w:t>
+      </w:r>
+      <w:r>
+        <w:t xml:space="preserve">, mit pro Runde sinkender Messlatte (Prüf-Schleife, siehe Abb. 2).</w:t>
       </w:r>
     </w:p>
     <w:p>
@@ -1890,7 +1947,7 @@
         <w:t xml:space="preserve">gemeinsam</w:t>
       </w:r>
       <w:r>
-        <w:t xml:space="preserve">, wieder in der Schleife bis „ok".</w:t>
+        <w:t xml:space="preserve">, wieder in der Schleife bis „ok" (gleiche 5-Runden-Regel).</w:t>
       </w:r>
     </w:p>
     <w:p>
@@ -2382,20 +2439,29 @@
             <w:r>
               <w:drawing>
                 <wp:inline>
-                  <wp:extent cx="5753100" cy="2339800"/>
+                  <wp:extent cx="5753100" cy="3835400"/>
                   <wp:effectExtent b="0" l="0" r="0" t="0"/>
-                  <wp:docPr descr="Diagramm des Lane-Loops: Build-Agent schreibt Code, Gates prüfen, bei Rot zurück an dieselbe Session, maximal zehnmal" title="" id="39" name="Picture"/>
+                  <wp:docPr descr="" title="" id="39" name="Picture"/>
                   <a:graphic>
                     <a:graphicData uri="http://schemas.openxmlformats.org/drawingml/2006/picture">
                       <pic:pic>
                         <pic:nvPicPr>
-                          <pic:cNvPr descr="diagramm-3.png" id="40" name="Picture"/>
+                          <pic:cNvPr descr="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" id="40" name="Picture"/>
                           <pic:cNvPicPr>
                             <a:picLocks noChangeArrowheads="1" noChangeAspect="1"/>
                           </pic:cNvPicPr>
                         </pic:nvPicPr>
                         <pic:blipFill>
-                          <a:blip r:embed="rId38"/>
+                          <a:blip>
+                            <a:extLst>
+                              <a:ext uri="{28A0092B-C50C-407E-A947-70E740481C1C}">
+                                <a14:useLocalDpi xmlns:a14="http://schemas.microsoft.com/office/drawing/2010/main" val="0"/>
+                              </a:ext>
+                              <a:ext uri="{96DAC541-7B7A-43D3-8B79-37D633B846F1}">
+                                <asvg:svgBlip xmlns:asvg="http://schemas.microsoft.com/office/drawing/2016/SVG/main" r:embed="rId38"/>
+                              </a:ext>
+                            </a:extLst>
+                          </a:blip>
                           <a:stretch>
                             <a:fillRect/>
                           </a:stretch>
@@ -2403,7 +2469,7 @@
                         <pic:spPr bwMode="auto">
                           <a:xfrm>
                             <a:off x="0" y="0"/>
-                            <a:ext cx="5753100" cy="2339800"/>
+                            <a:ext cx="5753100" cy="3835400"/>
                           </a:xfrm>
                           <a:prstGeom prst="rect">
                             <a:avLst/>
@@ -2927,7 +2993,48 @@
         <w:t xml:space="preserve">bis „ok"</w:t>
       </w:r>
       <w:r>
-        <w:t xml:space="preserve">.</w:t>
+        <w:t xml:space="preserve">, höchstens</w:t>
+      </w:r>
+      <w:r>
+        <w:t xml:space="preserve"> </w:t>
+      </w:r>
+      <w:r>
+        <w:rPr>
+          <w:b/>
+          <w:bCs/>
+        </w:rPr>
+        <w:t xml:space="preserve">5 Runden</w:t>
+      </w:r>
+      <w:r>
+        <w:t xml:space="preserve">. Dabei sinkt die Messlatte pro Runde: Runde 1 behebt alle Mängel, Runde 2 nur noch kritische und mittlere (P1+P2), ab Runde 3 nur noch kritische (P1) — kleinere Punkte werden als bekannte Einschränkungen festgehalten statt endlos nachpoliert.</w:t>
+      </w:r>
+    </w:p>
+    <w:p>
+      <w:pPr>
+        <w:pStyle w:val="Compact"/>
+        <w:numPr>
+          <w:ilvl w:val="0"/>
+          <w:numId w:val="1008"/>
+        </w:numPr>
+      </w:pPr>
+      <w:r>
+        <w:t xml:space="preserve">Damit der Prüfer nicht immer wieder dasselbe anmerkt, bekommt er ab Runde 2 die</w:t>
+      </w:r>
+      <w:r>
+        <w:t xml:space="preserve"> </w:t>
+      </w:r>
+      <w:r>
+        <w:rPr>
+          <w:b/>
+          <w:bCs/>
+        </w:rPr>
+        <w:t xml:space="preserve">Mängelliste der Vorrunden samt Begründung</w:t>
+      </w:r>
+      <w:r>
+        <w:t xml:space="preserve"> </w:t>
+      </w:r>
+      <w:r>
+        <w:t xml:space="preserve">mit („behoben" bzw. „bewusst nicht übernommen, weil …").</w:t>
       </w:r>
     </w:p>
     <w:p>
@@ -3166,20 +3273,29 @@
             <w:r>
               <w:drawing>
                 <wp:inline>
-                  <wp:extent cx="5753100" cy="2270772"/>
+                  <wp:extent cx="5753100" cy="3835400"/>
                   <wp:effectExtent b="0" l="0" r="0" t="0"/>
-                  <wp:docPr descr="Diagramm der Triage in Phase 6: scope_gap wird Follow-up-Issue, implementation und trivial gehen in den Fix-Zyklus" title="" id="48" name="Picture"/>
+                  <wp:docPr descr="" title="" id="48" name="Picture"/>
                   <a:graphic>
                     <a:graphicData uri="http://schemas.openxmlformats.org/drawingml/2006/picture">
                       <pic:pic>
                         <pic:nvPicPr>
-                          <pic:cNvPr descr="diagramm-4.png" id="49" name="Picture"/>
+                          <pic:cNvPr descr="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" id="49" name="Picture"/>
                           <pic:cNvPicPr>
                             <a:picLocks noChangeArrowheads="1" noChangeAspect="1"/>
                           </pic:cNvPicPr>
                         </pic:nvPicPr>
                         <pic:blipFill>
-                          <a:blip r:embed="rId47"/>
+                          <a:blip>
+                            <a:extLst>
+                              <a:ext uri="{28A0092B-C50C-407E-A947-70E740481C1C}">
+                                <a14:useLocalDpi xmlns:a14="http://schemas.microsoft.com/office/drawing/2010/main" val="0"/>
+                              </a:ext>
+                              <a:ext uri="{96DAC541-7B7A-43D3-8B79-37D633B846F1}">
+                                <asvg:svgBlip xmlns:asvg="http://schemas.microsoft.com/office/drawing/2016/SVG/main" r:embed="rId47"/>
+                              </a:ext>
+                            </a:extLst>
+                          </a:blip>
                           <a:stretch>
                             <a:fillRect/>
                           </a:stretch>
@@ -3187,7 +3303,7 @@
                         <pic:spPr bwMode="auto">
                           <a:xfrm>
                             <a:off x="0" y="0"/>
-                            <a:ext cx="5753100" cy="2270772"/>
+                            <a:ext cx="5753100" cy="3835400"/>
                           </a:xfrm>
                           <a:prstGeom prst="rect">
                             <a:avLst/>
@@ -3699,7 +3815,7 @@
               <w:jc w:val="left"/>
             </w:pPr>
             <w:r>
-              <w:t xml:space="preserve">Phase 3: max. 10 Fix-Iterationen · Phase 4: max. 10 Runden · Phase 6: max. 3 Zyklen · Phase 7: max. 45 min Warten</w:t>
+              <w:t xml:space="preserve">Phase 3: max. 10 Fix-Iterationen · Phase 4: max. 10 Runden · Phase 5: max. 5 Review-Runden · Phase 6: max. 3 Zyklen · Phase 7: max. 45 min Warten</w:t>
             </w:r>
           </w:p>
         </w:tc>

</xml_diff>